<commit_message>
Thesis combined file: List of Figures now includes Figure 5.1, Chapter 5 page numbers corrected
Co-Authored-By: Claude Fable 5.1 <noreply@anthropic.com>
Claude-Session: https://claude.ai/code/session_01QHSSv245Aernyaebt7V5kS
</commit_message>
<xml_diff>
--- a/docs/Yasir_Thesis_Chapters_1-5.docx
+++ b/docs/Yasir_Thesis_Chapters_1-5.docx
@@ -5878,12 +5878,120 @@
         </w:rPr>
         <w:t>5 Research Architecture and Trust-Centric Consent Model</w:t>
         <w:tab/>
-        <w:t>50</w:t>
+        <w:t>49</w:t>
       </w:r>
     </w:p>
     <w:p xmlns:ns0="http://halah">
       <w:pPr>
         <w:tabs>
+          <w:tab w:pos="8504" w:val="right" w:leader="dot"/>
+          <w:tab w:pos="8504" w:val="right" w:leader="dot"/>
+          <w:tab w:pos="8504" w:val="right" w:leader="dot"/>
+          <w:tab w:pos="8504" w:val="right" w:leader="dot"/>
+          <w:tab w:pos="8504" w:val="right" w:leader="dot"/>
+          <w:tab w:pos="8504" w:val="right" w:leader="dot"/>
+          <w:tab w:pos="8504" w:val="right" w:leader="dot"/>
+          <w:tab w:pos="8504" w:val="right" w:leader="dot"/>
+          <w:tab w:pos="8504" w:val="right" w:leader="dot"/>
+          <w:tab w:pos="8504" w:val="right" w:leader="dot"/>
+          <w:tab w:pos="8504" w:val="right" w:leader="dot"/>
+          <w:tab w:pos="8504" w:val="right" w:leader="dot"/>
+          <w:tab w:pos="8504" w:val="right" w:leader="dot"/>
+          <w:tab w:pos="8504" w:val="right" w:leader="dot"/>
+          <w:tab w:pos="8504" w:val="right" w:leader="dot"/>
+          <w:tab w:pos="8504" w:val="right" w:leader="dot"/>
+          <w:tab w:pos="8504" w:val="right" w:leader="dot"/>
+          <w:tab w:pos="8504" w:val="right" w:leader="dot"/>
+          <w:tab w:pos="8504" w:val="right" w:leader="dot"/>
+          <w:tab w:pos="8504" w:val="right" w:leader="dot"/>
+          <w:tab w:pos="8504" w:val="right" w:leader="dot"/>
+          <w:tab w:pos="8504" w:val="right" w:leader="dot"/>
+          <w:tab w:pos="8504" w:val="right" w:leader="dot"/>
+          <w:tab w:pos="8504" w:val="right" w:leader="dot"/>
+          <w:tab w:pos="8504" w:val="right" w:leader="dot"/>
+          <w:tab w:pos="8504" w:val="right" w:leader="dot"/>
+          <w:tab w:pos="8504" w:val="right" w:leader="dot"/>
+          <w:tab w:pos="8504" w:val="right" w:leader="dot"/>
+          <w:tab w:pos="8504" w:val="right" w:leader="dot"/>
+          <w:tab w:pos="8504" w:val="right" w:leader="dot"/>
+          <w:tab w:pos="8504" w:val="right" w:leader="dot"/>
+          <w:tab w:pos="8504" w:val="right" w:leader="dot"/>
+          <w:tab w:pos="8504" w:val="right" w:leader="dot"/>
+          <w:tab w:pos="8504" w:val="right" w:leader="dot"/>
+          <w:tab w:pos="8504" w:val="right" w:leader="dot"/>
+          <w:tab w:pos="8504" w:val="right" w:leader="dot"/>
+          <w:tab w:pos="8504" w:val="right" w:leader="dot"/>
+          <w:tab w:pos="8504" w:val="right" w:leader="dot"/>
+          <w:tab w:pos="8504" w:val="right" w:leader="dot"/>
+          <w:tab w:pos="8504" w:val="right" w:leader="dot"/>
+          <w:tab w:pos="8504" w:val="right" w:leader="dot"/>
+          <w:tab w:pos="8504" w:val="right" w:leader="dot"/>
+          <w:tab w:pos="8504" w:val="right" w:leader="dot"/>
+          <w:tab w:pos="8504" w:val="right" w:leader="dot"/>
+          <w:tab w:pos="8504" w:val="right" w:leader="dot"/>
+          <w:tab w:pos="8504" w:val="right" w:leader="dot"/>
+          <w:tab w:pos="8504" w:val="right" w:leader="dot"/>
+          <w:tab w:pos="8504" w:val="right" w:leader="dot"/>
+          <w:tab w:pos="8504" w:val="right" w:leader="dot"/>
+          <w:tab w:pos="8504" w:val="right" w:leader="dot"/>
+          <w:tab w:pos="8504" w:val="right" w:leader="dot"/>
+          <w:tab w:pos="8504" w:val="right" w:leader="dot"/>
+          <w:tab w:pos="8504" w:val="right" w:leader="dot"/>
+          <w:tab w:pos="8504" w:val="right" w:leader="dot"/>
+          <w:tab w:pos="8504" w:val="right" w:leader="dot"/>
+          <w:tab w:pos="8504" w:val="right" w:leader="dot"/>
+          <w:tab w:pos="8504" w:val="right" w:leader="dot"/>
+          <w:tab w:pos="8504" w:val="right" w:leader="dot"/>
+          <w:tab w:pos="8504" w:val="right" w:leader="dot"/>
+          <w:tab w:pos="8504" w:val="right" w:leader="dot"/>
+          <w:tab w:pos="8504" w:val="right" w:leader="dot"/>
+          <w:tab w:pos="8504" w:val="right" w:leader="dot"/>
+          <w:tab w:pos="8504" w:val="right" w:leader="dot"/>
+          <w:tab w:pos="8504" w:val="right" w:leader="dot"/>
+          <w:tab w:pos="8504" w:val="right" w:leader="dot"/>
+          <w:tab w:pos="8504" w:val="right" w:leader="dot"/>
+          <w:tab w:pos="8504" w:val="right" w:leader="dot"/>
+          <w:tab w:pos="8504" w:val="right" w:leader="dot"/>
+          <w:tab w:pos="8504" w:val="right" w:leader="dot"/>
+          <w:tab w:pos="8504" w:val="right" w:leader="dot"/>
+          <w:tab w:pos="8504" w:val="right" w:leader="dot"/>
+          <w:tab w:pos="8504" w:val="right" w:leader="dot"/>
+          <w:tab w:pos="8504" w:val="right" w:leader="dot"/>
+          <w:tab w:pos="8504" w:val="right" w:leader="dot"/>
+          <w:tab w:pos="8504" w:val="right" w:leader="dot"/>
+          <w:tab w:pos="8504" w:val="right" w:leader="dot"/>
+          <w:tab w:pos="8504" w:val="right" w:leader="dot"/>
+          <w:tab w:pos="8504" w:val="right" w:leader="dot"/>
+          <w:tab w:pos="8504" w:val="right" w:leader="dot"/>
+          <w:tab w:pos="8504" w:val="right" w:leader="dot"/>
+          <w:tab w:pos="8504" w:val="right" w:leader="dot"/>
+          <w:tab w:pos="8504" w:val="right" w:leader="dot"/>
+          <w:tab w:pos="8504" w:val="right" w:leader="dot"/>
+          <w:tab w:pos="8504" w:val="right" w:leader="dot"/>
+          <w:tab w:pos="8504" w:val="right" w:leader="dot"/>
+          <w:tab w:pos="8504" w:val="right" w:leader="dot"/>
+          <w:tab w:pos="8504" w:val="right" w:leader="dot"/>
+          <w:tab w:pos="8504" w:val="right" w:leader="dot"/>
+        </w:tabs>
+        <w:spacing w:after="40" w:before="0"/>
+        <w:ind w:left="454"/>
+        <w:jc w:val="left"/>
+      </w:pPr>
+      <w:r>
+        <w:rPr>
+          <w:rFonts w:ascii="Palatino Linotype" w:hAnsi="Palatino Linotype"/>
+          <w:b w:val="0"/>
+          <w:sz w:val="22"/>
+        </w:rPr>
+        <w:t>5.1 Introduction</w:t>
+        <w:tab/>
+        <w:t>49</w:t>
+      </w:r>
+    </w:p>
+    <w:p xmlns:ns0="http://halah">
+      <w:pPr>
+        <w:tabs>
+          <w:tab w:pos="8504" w:val="right" w:leader="dot"/>
           <w:tab w:pos="8504" w:val="right" w:leader="dot"/>
           <w:tab w:pos="8504" w:val="right" w:leader="dot"/>
           <w:tab w:pos="8504" w:val="right" w:leader="dot"/>
@@ -5985,12 +6093,13 @@
         </w:rPr>
         <w:t>5.2 Layered Architecture and Component Decomposition</w:t>
         <w:tab/>
-        <w:t>51</w:t>
+        <w:t>49</w:t>
       </w:r>
     </w:p>
     <w:p xmlns:ns0="http://halah">
       <w:pPr>
         <w:tabs>
+          <w:tab w:pos="8504" w:val="right" w:leader="dot"/>
           <w:tab w:pos="8504" w:val="right" w:leader="dot"/>
           <w:tab w:pos="8504" w:val="right" w:leader="dot"/>
           <w:tab w:pos="8504" w:val="right" w:leader="dot"/>
@@ -6189,6 +6298,7 @@
           <w:tab w:pos="8504" w:val="right" w:leader="dot"/>
           <w:tab w:pos="8504" w:val="right" w:leader="dot"/>
           <w:tab w:pos="8504" w:val="right" w:leader="dot"/>
+          <w:tab w:pos="8504" w:val="right" w:leader="dot"/>
         </w:tabs>
         <w:spacing w:after="40" w:before="0"/>
         <w:ind w:left="454"/>
@@ -6299,6 +6409,7 @@
           <w:tab w:pos="8504" w:val="right" w:leader="dot"/>
           <w:tab w:pos="8504" w:val="right" w:leader="dot"/>
           <w:tab w:pos="8504" w:val="right" w:leader="dot"/>
+          <w:tab w:pos="8504" w:val="right" w:leader="dot"/>
         </w:tabs>
         <w:spacing w:after="40" w:before="0"/>
         <w:ind w:left="454"/>
@@ -6410,6 +6521,7 @@
           <w:tab w:pos="8504" w:val="right" w:leader="dot"/>
           <w:tab w:pos="8504" w:val="right" w:leader="dot"/>
           <w:tab w:pos="8504" w:val="right" w:leader="dot"/>
+          <w:tab w:pos="8504" w:val="right" w:leader="dot"/>
         </w:tabs>
         <w:spacing w:after="40" w:before="0"/>
         <w:ind w:left="1020"/>
@@ -6522,6 +6634,7 @@
           <w:tab w:pos="8504" w:val="right" w:leader="dot"/>
           <w:tab w:pos="8504" w:val="right" w:leader="dot"/>
           <w:tab w:pos="8504" w:val="right" w:leader="dot"/>
+          <w:tab w:pos="8504" w:val="right" w:leader="dot"/>
         </w:tabs>
         <w:spacing w:after="40" w:before="0"/>
         <w:ind w:left="1020"/>
@@ -6635,6 +6748,7 @@
           <w:tab w:pos="8504" w:val="right" w:leader="dot"/>
           <w:tab w:pos="8504" w:val="right" w:leader="dot"/>
           <w:tab w:pos="8504" w:val="right" w:leader="dot"/>
+          <w:tab w:pos="8504" w:val="right" w:leader="dot"/>
         </w:tabs>
         <w:spacing w:after="40" w:before="0"/>
         <w:ind w:left="1020"/>
@@ -6749,6 +6863,7 @@
           <w:tab w:pos="8504" w:val="right" w:leader="dot"/>
           <w:tab w:pos="8504" w:val="right" w:leader="dot"/>
           <w:tab w:pos="8504" w:val="right" w:leader="dot"/>
+          <w:tab w:pos="8504" w:val="right" w:leader="dot"/>
         </w:tabs>
         <w:spacing w:after="40" w:before="0"/>
         <w:ind w:left="454"/>
@@ -6864,6 +6979,7 @@
           <w:tab w:pos="8504" w:val="right" w:leader="dot"/>
           <w:tab w:pos="8504" w:val="right" w:leader="dot"/>
           <w:tab w:pos="8504" w:val="right" w:leader="dot"/>
+          <w:tab w:pos="8504" w:val="right" w:leader="dot"/>
         </w:tabs>
         <w:spacing w:after="40" w:before="0"/>
         <w:ind w:left="1020"/>
@@ -6980,6 +7096,7 @@
           <w:tab w:pos="8504" w:val="right" w:leader="dot"/>
           <w:tab w:pos="8504" w:val="right" w:leader="dot"/>
           <w:tab w:pos="8504" w:val="right" w:leader="dot"/>
+          <w:tab w:pos="8504" w:val="right" w:leader="dot"/>
         </w:tabs>
         <w:spacing w:after="40" w:before="0"/>
         <w:ind w:left="1020"/>
@@ -7097,6 +7214,7 @@
           <w:tab w:pos="8504" w:val="right" w:leader="dot"/>
           <w:tab w:pos="8504" w:val="right" w:leader="dot"/>
           <w:tab w:pos="8504" w:val="right" w:leader="dot"/>
+          <w:tab w:pos="8504" w:val="right" w:leader="dot"/>
         </w:tabs>
         <w:spacing w:after="40" w:before="0"/>
         <w:ind w:left="1020"/>
@@ -7215,6 +7333,7 @@
           <w:tab w:pos="8504" w:val="right" w:leader="dot"/>
           <w:tab w:pos="8504" w:val="right" w:leader="dot"/>
           <w:tab w:pos="8504" w:val="right" w:leader="dot"/>
+          <w:tab w:pos="8504" w:val="right" w:leader="dot"/>
         </w:tabs>
         <w:spacing w:after="40" w:before="0"/>
         <w:ind w:left="454"/>
@@ -7334,6 +7453,7 @@
           <w:tab w:pos="8504" w:val="right" w:leader="dot"/>
           <w:tab w:pos="8504" w:val="right" w:leader="dot"/>
           <w:tab w:pos="8504" w:val="right" w:leader="dot"/>
+          <w:tab w:pos="8504" w:val="right" w:leader="dot"/>
         </w:tabs>
         <w:spacing w:after="40" w:before="0"/>
         <w:ind w:left="1020"/>
@@ -7454,6 +7574,7 @@
           <w:tab w:pos="8504" w:val="right" w:leader="dot"/>
           <w:tab w:pos="8504" w:val="right" w:leader="dot"/>
           <w:tab w:pos="8504" w:val="right" w:leader="dot"/>
+          <w:tab w:pos="8504" w:val="right" w:leader="dot"/>
         </w:tabs>
         <w:spacing w:after="40" w:before="0"/>
         <w:ind w:left="1020"/>
@@ -7575,6 +7696,7 @@
           <w:tab w:pos="8504" w:val="right" w:leader="dot"/>
           <w:tab w:pos="8504" w:val="right" w:leader="dot"/>
           <w:tab w:pos="8504" w:val="right" w:leader="dot"/>
+          <w:tab w:pos="8504" w:val="right" w:leader="dot"/>
         </w:tabs>
         <w:spacing w:after="40" w:before="0"/>
         <w:ind w:left="454"/>
@@ -7696,6 +7818,7 @@
           <w:tab w:pos="8504" w:val="right" w:leader="dot"/>
           <w:tab w:pos="8504" w:val="right" w:leader="dot"/>
           <w:tab w:pos="8504" w:val="right" w:leader="dot"/>
+          <w:tab w:pos="8504" w:val="right" w:leader="dot"/>
         </w:tabs>
         <w:spacing w:after="40" w:before="0"/>
         <w:ind w:left="454"/>
@@ -7835,6 +7958,31 @@
           <w:b w:val="0"/>
           <w:sz w:val="22"/>
         </w:rPr>
+        <w:t>5.1 Layered MVC architecture and component decomposition of the HALAH framework.</w:t>
+        <w:tab/>
+        <w:t>50</w:t>
+      </w:r>
+    </w:p>
+    <w:p xmlns:ns1="http://halah">
+      <w:pPr>
+        <w:tabs>
+          <w:tab w:pos="8504" w:val="right" w:leader="dot"/>
+          <w:tab w:pos="8504" w:val="right" w:leader="dot"/>
+          <w:tab w:pos="8504" w:val="right" w:leader="dot"/>
+          <w:tab w:pos="8504" w:val="right" w:leader="dot"/>
+          <w:tab w:pos="8504" w:val="right" w:leader="dot"/>
+          <w:tab w:pos="8504" w:val="right" w:leader="dot"/>
+        </w:tabs>
+        <w:spacing w:after="40" w:before="0"/>
+        <w:ind w:left="454"/>
+        <w:jc w:val="left"/>
+      </w:pPr>
+      <w:r>
+        <w:rPr>
+          <w:rFonts w:ascii="Palatino Linotype" w:hAnsi="Palatino Linotype"/>
+          <w:b w:val="0"/>
+          <w:sz w:val="22"/>
+        </w:rPr>
         <w:t>5.2 Functional decomposition of the MVC components.</w:t>
         <w:tab/>
         <w:t>51</w:t>
@@ -7843,6 +7991,7 @@
     <w:p xmlns:ns1="http://halah">
       <w:pPr>
         <w:tabs>
+          <w:tab w:pos="8504" w:val="right" w:leader="dot"/>
           <w:tab w:pos="8504" w:val="right" w:leader="dot"/>
           <w:tab w:pos="8504" w:val="right" w:leader="dot"/>
           <w:tab w:pos="8504" w:val="right" w:leader="dot"/>
@@ -7875,6 +8024,7 @@
           <w:tab w:pos="8504" w:val="right" w:leader="dot"/>
           <w:tab w:pos="8504" w:val="right" w:leader="dot"/>
           <w:tab w:pos="8504" w:val="right" w:leader="dot"/>
+          <w:tab w:pos="8504" w:val="right" w:leader="dot"/>
         </w:tabs>
         <w:spacing w:after="40" w:before="0"/>
         <w:ind w:left="454"/>
@@ -7902,6 +8052,7 @@
           <w:tab w:pos="8504" w:val="right" w:leader="dot"/>
           <w:tab w:pos="8504" w:val="right" w:leader="dot"/>
           <w:tab w:pos="8504" w:val="right" w:leader="dot"/>
+          <w:tab w:pos="8504" w:val="right" w:leader="dot"/>
         </w:tabs>
         <w:spacing w:after="40" w:before="0"/>
         <w:ind w:left="454"/>
@@ -7930,6 +8081,7 @@
           <w:tab w:pos="8504" w:val="right" w:leader="dot"/>
           <w:tab w:pos="8504" w:val="right" w:leader="dot"/>
           <w:tab w:pos="8504" w:val="right" w:leader="dot"/>
+          <w:tab w:pos="8504" w:val="right" w:leader="dot"/>
         </w:tabs>
         <w:spacing w:after="40" w:before="0"/>
         <w:ind w:left="454"/>
@@ -7959,6 +8111,7 @@
           <w:tab w:pos="8504" w:val="right" w:leader="dot"/>
           <w:tab w:pos="8504" w:val="right" w:leader="dot"/>
           <w:tab w:pos="8504" w:val="right" w:leader="dot"/>
+          <w:tab w:pos="8504" w:val="right" w:leader="dot"/>
         </w:tabs>
         <w:spacing w:after="40" w:before="0"/>
         <w:ind w:left="454"/>
@@ -7989,6 +8142,7 @@
           <w:tab w:pos="8504" w:val="right" w:leader="dot"/>
           <w:tab w:pos="8504" w:val="right" w:leader="dot"/>
           <w:tab w:pos="8504" w:val="right" w:leader="dot"/>
+          <w:tab w:pos="8504" w:val="right" w:leader="dot"/>
         </w:tabs>
         <w:spacing w:after="40" w:before="0"/>
         <w:ind w:left="454"/>
@@ -8008,6 +8162,7 @@
     <w:p xmlns:ns1="http://halah">
       <w:pPr>
         <w:tabs>
+          <w:tab w:pos="8504" w:val="right" w:leader="dot"/>
           <w:tab w:pos="8504" w:val="right" w:leader="dot"/>
           <w:tab w:pos="8504" w:val="right" w:leader="dot"/>
           <w:tab w:pos="8504" w:val="right" w:leader="dot"/>

</xml_diff>

<commit_message>
Combined Chapters 1-5 rebuilt with the current chapter sources
Co-Authored-By: Claude Fable 5.1 <noreply@anthropic.com>
Claude-Session: https://claude.ai/code/session_01QHSSv245Aernyaebt7V5kS
</commit_message>
<xml_diff>
--- a/docs/Yasir_Thesis_Chapters_1-5.docx
+++ b/docs/Yasir_Thesis_Chapters_1-5.docx
@@ -229,6 +229,7 @@
     <w:p>
       <w:pPr>
         <w:pStyle w:val="1"/>
+        <w:keepNext/>
         <w:jc w:val="center"/>
       </w:pPr>
       <w:r>
@@ -261,6 +262,7 @@
     <w:p>
       <w:pPr>
         <w:pStyle w:val="1"/>
+        <w:keepNext/>
         <w:jc w:val="center"/>
       </w:pPr>
       <w:r>
@@ -289,6 +291,7 @@
     <w:p>
       <w:pPr>
         <w:pStyle w:val="1"/>
+        <w:keepNext/>
         <w:jc w:val="center"/>
       </w:pPr>
       <w:r>
@@ -333,6 +336,7 @@
     <w:p>
       <w:pPr>
         <w:pStyle w:val="1"/>
+        <w:keepNext/>
         <w:jc w:val="center"/>
       </w:pPr>
       <w:r>
@@ -383,6 +387,7 @@
     <w:p>
       <w:pPr>
         <w:pStyle w:val="1"/>
+        <w:keepNext/>
         <w:jc w:val="center"/>
       </w:pPr>
       <w:r>
@@ -617,7 +622,7 @@
         </w:rPr>
         <w:t>1.2 Statement of the Problem</w:t>
         <w:tab/>
-        <w:t>1</w:t>
+        <w:t>2</w:t>
       </w:r>
     </w:p>
     <w:p>
@@ -817,7 +822,7 @@
         </w:rPr>
         <w:t>1.8.1 The Audit Ledger</w:t>
         <w:tab/>
-        <w:t>5</w:t>
+        <w:t>6</w:t>
       </w:r>
     </w:p>
     <w:p>
@@ -1637,7 +1642,7 @@
         </w:rPr>
         <w:t>3.3 Key Definitions</w:t>
         <w:tab/>
-        <w:t>27</w:t>
+        <w:t>28</w:t>
       </w:r>
     </w:p>
     <w:p>
@@ -2057,7 +2062,7 @@
         </w:rPr>
         <w:t>4.9 Overview of Solution for RQ5</w:t>
         <w:tab/>
-        <w:t>37</w:t>
+        <w:t>38</w:t>
       </w:r>
     </w:p>
     <w:p>
@@ -2541,6 +2546,7 @@
     <w:p>
       <w:pPr>
         <w:pStyle w:val="1"/>
+        <w:keepNext/>
         <w:jc w:val="center"/>
       </w:pPr>
       <w:r>
@@ -2819,6 +2825,7 @@
     <w:p>
       <w:pPr>
         <w:pStyle w:val="1"/>
+        <w:keepNext/>
         <w:jc w:val="center"/>
       </w:pPr>
       <w:r>
@@ -3177,6 +3184,7 @@
     <w:p>
       <w:pPr>
         <w:pStyle w:val="1"/>
+        <w:keepNext/>
         <w:jc w:val="center"/>
       </w:pPr>
       <w:r>
@@ -3282,6 +3290,7 @@
     <w:p>
       <w:pPr>
         <w:pStyle w:val="1"/>
+        <w:keepNext/>
         <w:spacing w:before="360"/>
       </w:pPr>
       <w:r/>
@@ -3302,6 +3311,7 @@
     <w:p>
       <w:pPr>
         <w:pStyle w:val="2"/>
+        <w:keepNext/>
       </w:pPr>
       <w:r>
         <w:t>1.1 Introduction</w:t>
@@ -3337,6 +3347,7 @@
     <w:p>
       <w:pPr>
         <w:pStyle w:val="2"/>
+        <w:keepNext/>
       </w:pPr>
       <w:r>
         <w:t>1.2 Statement of the Problem</w:t>
@@ -3364,6 +3375,7 @@
     <w:p>
       <w:pPr>
         <w:pStyle w:val="2"/>
+        <w:keepNext/>
       </w:pPr>
       <w:r>
         <w:t>1.3 Research Motivation</w:t>
@@ -3410,6 +3422,7 @@
     <w:p>
       <w:pPr>
         <w:pStyle w:val="2"/>
+        <w:keepNext/>
       </w:pPr>
       <w:r>
         <w:t>1.4 Decentralised Identity Technology</w:t>
@@ -3424,6 +3437,7 @@
     <w:p>
       <w:pPr>
         <w:pStyle w:val="3"/>
+        <w:keepNext/>
       </w:pPr>
       <w:r>
         <w:t>1.4.1 Decentralised Identifiers (DIDs)</w:t>
@@ -3438,6 +3452,7 @@
     <w:p>
       <w:pPr>
         <w:pStyle w:val="3"/>
+        <w:keepNext/>
       </w:pPr>
       <w:r>
         <w:t>1.4.2 Verifiable Credentials (VCs)</w:t>
@@ -3452,6 +3467,7 @@
     <w:p>
       <w:pPr>
         <w:pStyle w:val="3"/>
+        <w:keepNext/>
       </w:pPr>
       <w:r>
         <w:t>1.4.3 Trusted Issuers and Credential Verification</w:t>
@@ -3466,6 +3482,7 @@
     <w:p>
       <w:pPr>
         <w:pStyle w:val="2"/>
+        <w:keepNext/>
       </w:pPr>
       <w:r>
         <w:t>1.5 Multi-Party Authorisation</w:t>
@@ -3486,6 +3503,7 @@
     <w:p>
       <w:pPr>
         <w:pStyle w:val="2"/>
+        <w:keepNext/>
       </w:pPr>
       <w:r>
         <w:t>1.6 The Relationship between Multi-Party Authorisation and Patient Consent</w:t>
@@ -3500,6 +3518,7 @@
     <w:p>
       <w:pPr>
         <w:pStyle w:val="2"/>
+        <w:keepNext/>
       </w:pPr>
       <w:r>
         <w:t>1.7 Purpose of Using Multi-Party Authorisation in Consent Management</w:t>
@@ -3514,6 +3533,7 @@
     <w:p>
       <w:pPr>
         <w:pStyle w:val="2"/>
+        <w:keepNext/>
       </w:pPr>
       <w:r>
         <w:t>1.8 Authorisation Evidence and Auditability</w:t>
@@ -3528,6 +3548,7 @@
     <w:p>
       <w:pPr>
         <w:pStyle w:val="3"/>
+        <w:keepNext/>
       </w:pPr>
       <w:r>
         <w:t>1.8.1 The Audit Ledger</w:t>
@@ -3542,6 +3563,7 @@
     <w:p>
       <w:pPr>
         <w:pStyle w:val="2"/>
+        <w:keepNext/>
       </w:pPr>
       <w:r>
         <w:t>1.9 Consent Management Systems</w:t>
@@ -3556,6 +3578,7 @@
     <w:p>
       <w:pPr>
         <w:pStyle w:val="2"/>
+        <w:keepNext/>
       </w:pPr>
       <w:r>
         <w:t>1.10 Challenges Faced by Current Consent Management Systems</w:t>
@@ -3582,6 +3605,7 @@
     <w:p>
       <w:pPr>
         <w:pStyle w:val="2"/>
+        <w:keepNext/>
       </w:pPr>
       <w:r>
         <w:t>1.11 Research Contribution</w:t>
@@ -3590,6 +3614,7 @@
     <w:p>
       <w:pPr>
         <w:pStyle w:val="3"/>
+        <w:keepNext/>
       </w:pPr>
       <w:r>
         <w:t>1.11.1 Scientific Contribution</w:t>
@@ -3607,6 +3632,7 @@
     <w:p>
       <w:pPr>
         <w:pStyle w:val="3"/>
+        <w:keepNext/>
       </w:pPr>
       <w:r>
         <w:t>1.11.2 Social Contribution</w:t>
@@ -3624,6 +3650,7 @@
     <w:p>
       <w:pPr>
         <w:pStyle w:val="2"/>
+        <w:keepNext/>
       </w:pPr>
       <w:r>
         <w:t>1.12 Thesis Plan</w:t>
@@ -3704,6 +3731,7 @@
     <w:p>
       <w:pPr>
         <w:pStyle w:val="2"/>
+        <w:keepNext/>
       </w:pPr>
       <w:r>
         <w:t>1.13 Conclusion</w:t>
@@ -3780,6 +3808,7 @@
     <w:p>
       <w:pPr>
         <w:pStyle w:val="1"/>
+        <w:keepNext/>
         <w:spacing w:before="360"/>
       </w:pPr>
       <w:r/>
@@ -3800,6 +3829,7 @@
     <w:p>
       <w:pPr>
         <w:pStyle w:val="2"/>
+        <w:keepNext/>
       </w:pPr>
       <w:r>
         <w:t>2.1 Introduction</w:t>
@@ -3823,6 +3853,7 @@
     <w:p>
       <w:pPr>
         <w:pStyle w:val="2"/>
+        <w:keepNext/>
       </w:pPr>
       <w:r>
         <w:t>2.2 Key Requirements for Trustworthy Multi-Party Consent Authorisation</w:t>
@@ -3846,6 +3877,7 @@
     <w:p>
       <w:pPr>
         <w:pStyle w:val="3"/>
+        <w:keepNext/>
       </w:pPr>
       <w:r>
         <w:t>2.2.1 Req 1: Representation of consent as an evaluable authorisation object</w:t>
@@ -3868,6 +3900,7 @@
     <w:p>
       <w:pPr>
         <w:pStyle w:val="3"/>
+        <w:keepNext/>
       </w:pPr>
       <w:r>
         <w:t>2.2.2 Req 2: Decentralised verification of identity and authority</w:t>
@@ -3890,6 +3923,7 @@
     <w:p>
       <w:pPr>
         <w:pStyle w:val="3"/>
+        <w:keepNext/>
       </w:pPr>
       <w:r>
         <w:t>2.2.3 Req 3: Multi-party authorisation through a verifiable threshold</w:t>
@@ -3912,6 +3946,7 @@
     <w:p>
       <w:pPr>
         <w:pStyle w:val="3"/>
+        <w:keepNext/>
       </w:pPr>
       <w:r>
         <w:t>2.2.4 Req 4: Policy- and context-aware enforcement at the time of access</w:t>
@@ -3934,6 +3969,7 @@
     <w:p>
       <w:pPr>
         <w:pStyle w:val="3"/>
+        <w:keepNext/>
       </w:pPr>
       <w:r>
         <w:t>2.2.5 Req 5: Temporal validity and lifecycle control of consent</w:t>
@@ -3956,6 +3992,7 @@
     <w:p>
       <w:pPr>
         <w:pStyle w:val="3"/>
+        <w:keepNext/>
       </w:pPr>
       <w:r>
         <w:t>2.2.6 Req 6: Verifiable auditability and security assurance</w:t>
@@ -3978,6 +4015,7 @@
     <w:p>
       <w:pPr>
         <w:pStyle w:val="2"/>
+        <w:keepNext/>
       </w:pPr>
       <w:r>
         <w:t>2.3 Process Adopted for Shortlisting the Papers for SLR</w:t>
@@ -4028,6 +4066,7 @@
     <w:p>
       <w:pPr>
         <w:pStyle w:val="3"/>
+        <w:keepNext/>
       </w:pPr>
       <w:r>
         <w:t>2.3.1 Step 1: Criteria for Searching the Literature</w:t>
@@ -5067,6 +5106,7 @@
     <w:p>
       <w:pPr>
         <w:pStyle w:val="3"/>
+        <w:keepNext/>
       </w:pPr>
       <w:r>
         <w:t>2.3.2 Step 2: Inclusion and Exclusion Criteria</w:t>
@@ -6169,6 +6209,7 @@
     <w:p>
       <w:pPr>
         <w:pStyle w:val="3"/>
+        <w:keepNext/>
       </w:pPr>
       <w:r>
         <w:t>2.3.3 Step 3: Quality Evaluation</w:t>
@@ -6237,6 +6278,7 @@
     <w:p>
       <w:pPr>
         <w:pStyle w:val="3"/>
+        <w:keepNext/>
       </w:pPr>
       <w:r>
         <w:t>2.3.4 Step 4: Shortlisted Papers for SLR and Categorising Them into Broad Areas</w:t>
@@ -9106,6 +9148,7 @@
     <w:p>
       <w:pPr>
         <w:pStyle w:val="2"/>
+        <w:keepNext/>
       </w:pPr>
       <w:r>
         <w:t>2.4 Summary of Papers Shortlisted in the SLR</w:t>
@@ -9123,6 +9166,7 @@
     <w:p>
       <w:pPr>
         <w:pStyle w:val="3"/>
+        <w:keepNext/>
       </w:pPr>
       <w:r>
         <w:t>2.4.1 Consent representation and blockchain-based consent governance (Req 1)</w:t>
@@ -10459,6 +10503,7 @@
     <w:p>
       <w:pPr>
         <w:pStyle w:val="3"/>
+        <w:keepNext/>
       </w:pPr>
       <w:r>
         <w:t>2.4.2 Decentralised identity and authority trust (Req 2)</w:t>
@@ -11802,6 +11847,7 @@
     <w:p>
       <w:pPr>
         <w:pStyle w:val="3"/>
+        <w:keepNext/>
       </w:pPr>
       <w:r>
         <w:t>2.4.3 Multi-party authorisation and collaborative consent (Req 3)</w:t>
@@ -14389,6 +14435,7 @@
     <w:p>
       <w:pPr>
         <w:pStyle w:val="3"/>
+        <w:keepNext/>
       </w:pPr>
       <w:r>
         <w:t>2.4.4 Policy- and context-aware access control (Req 4)</w:t>
@@ -16051,6 +16098,7 @@
     <w:p>
       <w:pPr>
         <w:pStyle w:val="3"/>
+        <w:keepNext/>
       </w:pPr>
       <w:r>
         <w:t>2.4.5 Temporal validity and consent lifecycle (Req 5)</w:t>
@@ -17710,6 +17758,7 @@
     <w:p>
       <w:pPr>
         <w:pStyle w:val="3"/>
+        <w:keepNext/>
       </w:pPr>
       <w:r>
         <w:t>2.4.6 Formal security assurance and empirical validation (Req 6)</w:t>
@@ -19366,6 +19415,7 @@
     <w:p>
       <w:pPr>
         <w:pStyle w:val="3"/>
+        <w:keepNext/>
       </w:pPr>
       <w:r>
         <w:t>2.4.7 Research Gaps in the Existing Studies from the Requirement Perspective</w:t>
@@ -26188,6 +26238,7 @@
     <w:p>
       <w:pPr>
         <w:pStyle w:val="2"/>
+        <w:keepNext/>
       </w:pPr>
       <w:r>
         <w:t>2.5 Trust-Oriented Multi-Party Consent Authorisation Framework</w:t>
@@ -26208,6 +26259,7 @@
     <w:p>
       <w:pPr>
         <w:pStyle w:val="3"/>
+        <w:keepNext/>
       </w:pPr>
       <w:r>
         <w:t>2.5.1 Representation of Consent as an Evaluable Authorisation Object (Req 1)</w:t>
@@ -26225,6 +26277,7 @@
     <w:p>
       <w:pPr>
         <w:pStyle w:val="3"/>
+        <w:keepNext/>
       </w:pPr>
       <w:r>
         <w:t>2.5.2 Decentralised Verification of Identity and Authority (Req 2)</w:t>
@@ -26242,6 +26295,7 @@
     <w:p>
       <w:pPr>
         <w:pStyle w:val="3"/>
+        <w:keepNext/>
       </w:pPr>
       <w:r>
         <w:t>2.5.3 Multi-Party Authorisation through a Verifiable Threshold (Req 3)</w:t>
@@ -26259,6 +26313,7 @@
     <w:p>
       <w:pPr>
         <w:pStyle w:val="3"/>
+        <w:keepNext/>
       </w:pPr>
       <w:r>
         <w:t>2.5.4 Policy- and Context-Aware Enforcement at the Time of Access (Req 4)</w:t>
@@ -26276,6 +26331,7 @@
     <w:p>
       <w:pPr>
         <w:pStyle w:val="3"/>
+        <w:keepNext/>
       </w:pPr>
       <w:r>
         <w:t>2.5.5 Temporal Validity and Lifecycle Control of Consent (Req 5)</w:t>
@@ -26293,6 +26349,7 @@
     <w:p>
       <w:pPr>
         <w:pStyle w:val="3"/>
+        <w:keepNext/>
       </w:pPr>
       <w:r>
         <w:t>2.5.6 Verifiable Auditability and Security Assurance (Req 6)</w:t>
@@ -26310,6 +26367,7 @@
     <w:p>
       <w:pPr>
         <w:pStyle w:val="2"/>
+        <w:keepNext/>
       </w:pPr>
       <w:r>
         <w:t>2.6 Conclusion</w:t>
@@ -26392,6 +26450,7 @@
     <w:p>
       <w:pPr>
         <w:pStyle w:val="1"/>
+        <w:keepNext/>
         <w:spacing w:before="360"/>
       </w:pPr>
       <w:r/>
@@ -26412,6 +26471,7 @@
     <w:p>
       <w:pPr>
         <w:pStyle w:val="2"/>
+        <w:keepNext/>
       </w:pPr>
       <w:r>
         <w:t>3.1 Introduction</w:t>
@@ -26426,6 +26486,7 @@
     <w:p>
       <w:pPr>
         <w:pStyle w:val="2"/>
+        <w:keepNext/>
       </w:pPr>
       <w:r>
         <w:t>3.2 Gaps in the Literature</w:t>
@@ -26524,6 +26585,7 @@
     <w:p>
       <w:pPr>
         <w:pStyle w:val="2"/>
+        <w:keepNext/>
       </w:pPr>
       <w:r>
         <w:t>3.3 Key Definitions</w:t>
@@ -26575,6 +26637,7 @@
     <w:p>
       <w:pPr>
         <w:pStyle w:val="2"/>
+        <w:keepNext/>
       </w:pPr>
       <w:r>
         <w:t>3.4 Research Questions</w:t>
@@ -26749,6 +26812,7 @@
     <w:p>
       <w:pPr>
         <w:pStyle w:val="3"/>
+        <w:keepNext/>
       </w:pPr>
       <w:r>
         <w:t>3.4.1 Research Questions as an Integrated Problem</w:t>
@@ -26924,40 +26988,19 @@
         <w:jc w:val="both"/>
       </w:pPr>
       <w:r>
-        <w:lastRenderedPageBreak/>
-        <w:t>A valid authorisation decision requires the simultaneous satisfaction of all relevant trust conditions. Consequently, failure of any individual condition results in denial. In the prototype, an ALLOW decision additionally requires the exploratory jurisdiction check V</w:t>
-      </w:r>
-      <w:r>
-        <w:rPr>
-          <w:vertAlign w:val="subscript"/>
-        </w:rPr>
-        <w:t>J</w:t>
-      </w:r>
-      <w:r>
-        <w:t xml:space="preserve"> </w:t>
-      </w:r>
-      <w:r>
-        <w:t>(Chapter 8)</w:t>
-      </w:r>
-      <w:r>
-        <w:t xml:space="preserve"> to pass and the Groth16 ZK proof (Groth 2016) to verify, so a request that satisfies the five predicates is still denied when either fails, as in Scenario 4 </w:t>
-      </w:r>
-      <w:r>
-        <w:t>(Chapter 10)</w:t>
-      </w:r>
-      <w:r>
-        <w:t xml:space="preserve"> and attack A9 </w:t>
-      </w:r>
-      <w:r>
-        <w:t>(Chapter 10)</w:t>
-      </w:r>
-      <w:r>
-        <w:t>. Formal security assurance does not constitute another authorisation condition to be evaluated at runtime. Instead, it provides a means of specifying, analysing, and verifying the security properties of the integrated authorisation mechanism. Thus, RQ6 operates as an assurance layer over the mechanisms established by RQ1–RQ5.</w:t>
+        <w:t xml:space="preserve">A valid authorisation decision requires the simultaneous satisfaction of all relevant trust conditions. Consequently, failure of any individual condition results in denial. In the prototype, an ALLOW decision additionally </w:t>
+      </w:r>
+      <w:r>
+        <w:t>requires the Groth16 ZK proof (Groth 2016) to verify, so a request that satisfies the five predicates is still denied when the proof fails, as in attack A9 (Chapter 10).</w:t>
+      </w:r>
+      <w:r>
+        <w:t xml:space="preserve"> Formal security assurance does not constitute another authorisation condition to be evaluated at runtime. Instead, it provides a means of specifying, analysing, and verifying the security properties of the integrated authorisation mechanism. Thus, RQ6 operates as an assurance layer over the mechanisms established by RQ1–RQ5.</w:t>
       </w:r>
     </w:p>
     <w:p>
       <w:pPr>
         <w:pStyle w:val="2"/>
+        <w:keepNext/>
       </w:pPr>
       <w:r>
         <w:t>3.5 Research Objectives</w:t>
@@ -26975,6 +27018,7 @@
     <w:p>
       <w:pPr>
         <w:pStyle w:val="3"/>
+        <w:keepNext/>
       </w:pPr>
       <w:r>
         <w:t>3.5.1 RO1: Trust-Centric Consent Model</w:t>
@@ -26992,6 +27036,7 @@
     <w:p>
       <w:pPr>
         <w:pStyle w:val="3"/>
+        <w:keepNext/>
       </w:pPr>
       <w:r>
         <w:t>3.5.2 RO2: Decentralised Identity and Authority Trust</w:t>
@@ -27009,6 +27054,7 @@
     <w:p>
       <w:pPr>
         <w:pStyle w:val="3"/>
+        <w:keepNext/>
       </w:pPr>
       <w:r>
         <w:t>3.5.3 RO3: Trustworthy Multi-Party Authorisation</w:t>
@@ -27026,6 +27072,7 @@
     <w:p>
       <w:pPr>
         <w:pStyle w:val="3"/>
+        <w:keepNext/>
       </w:pPr>
       <w:r>
         <w:t>3.5.4 RO4: Policy- and Context-Aware Access Control</w:t>
@@ -27043,6 +27090,7 @@
     <w:p>
       <w:pPr>
         <w:pStyle w:val="3"/>
+        <w:keepNext/>
       </w:pPr>
       <w:r>
         <w:t>3.5.5 RO5: Temporal and Lifecycle Trust</w:t>
@@ -27078,6 +27126,7 @@
     <w:p>
       <w:pPr>
         <w:pStyle w:val="3"/>
+        <w:keepNext/>
       </w:pPr>
       <w:r>
         <w:t>3.5.6 RO6: Formal Security Assurance and Empirical Validation</w:t>
@@ -27089,18 +27138,19 @@
         <w:jc w:val="both"/>
       </w:pPr>
       <w:r>
-        <w:t xml:space="preserve">The sixth research objective is to formally analyse and empirically evaluate whether the implemented framework satisfies its defined trust and authorisation properties under representative healthcare data-sharing scenarios. RO6 addresses RQ6 and combines formal security assurance with empirical validation of the proposed framework. The prototype must execute valid consent workflows, and it must also behave correctly when one or more trust conditions are violated. RO6 is partially completed through the implementation and initial scenario-based validation of the HALAH prototype. In particular, 46 automated tests cover signature rejection, proof tampering, credential checks, and twelve attack scenarios, A1 to A12, against the components of C and the contract. All twelve attacks are refused. Preliminary measurements of on-chain cost, confirmation latency, and processing time have been obtained, and a live out-of-jurisdiction request against a consent anchored on the deployed Sepolia contract was refused by the exploratory jurisdiction check of the application </w:t>
-      </w:r>
-      <w:r>
-        <w:t>(Chapter 8)</w:t>
-      </w:r>
-      <w:r>
-        <w:t>. The formal component will specify and analyse the security properties, consistency requirements, and soundness conditions of the trust-oriented authorisation mechanism. Although preliminary implementation and scenario-based testing support the current stage findings, the complete formal analysis, through proofs or model checking, and a larger evaluation under load will be conducted as part of next stage works.</w:t>
+        <w:t>The sixth research objective is to formally analyse and empirically evaluate whether the implemented framework satisfies its defined trust and authorisation properties under representative healthcare data-sharing scenarios. RO6 addresses RQ6 and combines formal security assurance with empirical validation of the proposed framework. The prototype must execute valid consent workflows, and it must also behave correctly when one or more trust conditions are violated. RO6 is partially completed through the implementation and initial scenario-based validation of the HALAH prototype. In particular, 46 automated tests cover signature rejection, proof tampering, credential checks, and twelve attack scenarios, A1 to A12, against the components of C and the contract. All twelve attacks are refused. Preliminary measurements of on-chain cost, confirmation latency, and processing time have been obtained</w:t>
+      </w:r>
+      <w:r>
+        <w:t>.</w:t>
+      </w:r>
+      <w:r>
+        <w:t xml:space="preserve"> The formal component will specify and analyse the security properties, consistency requirements, and soundness conditions of the trust-oriented authorisation mechanism. Although preliminary implementation and scenario-based testing support the current stage findings, the complete formal analysis, through proofs or model checking, and a larger evaluation under load will be conducted as part of next stage works.</w:t>
       </w:r>
     </w:p>
     <w:p>
       <w:pPr>
         <w:pStyle w:val="3"/>
+        <w:keepNext/>
       </w:pPr>
       <w:r>
         <w:t>3.5.7 Relationship Between Research Questions and Objectives</w:t>
@@ -28236,6 +28286,7 @@
     <w:p>
       <w:pPr>
         <w:pStyle w:val="2"/>
+        <w:keepNext/>
       </w:pPr>
       <w:r>
         <w:t>3.6 Conclusion</w:t>
@@ -28318,6 +28369,7 @@
     <w:p>
       <w:pPr>
         <w:pStyle w:val="1"/>
+        <w:keepNext/>
         <w:spacing w:before="360"/>
       </w:pPr>
       <w:r/>
@@ -28338,6 +28390,7 @@
     <w:p>
       <w:pPr>
         <w:pStyle w:val="2"/>
+        <w:keepNext/>
       </w:pPr>
       <w:r>
         <w:t>4.1 Introduction</w:t>
@@ -28352,6 +28405,7 @@
     <w:p>
       <w:pPr>
         <w:pStyle w:val="2"/>
+        <w:keepNext/>
       </w:pPr>
       <w:r>
         <w:t>4.2 Key Definitions</w:t>
@@ -28420,6 +28474,7 @@
     <w:p>
       <w:pPr>
         <w:pStyle w:val="2"/>
+        <w:keepNext/>
       </w:pPr>
       <w:r>
         <w:t>4.3 Selected Research Methodology</w:t>
@@ -28518,6 +28573,7 @@
     <w:p>
       <w:pPr>
         <w:pStyle w:val="2"/>
+        <w:keepNext/>
       </w:pPr>
       <w:r>
         <w:t>4.4 Solution Overview</w:t>
@@ -28883,16 +28939,7 @@
         <w:t>L</w:t>
       </w:r>
       <w:r>
-        <w:t>, together with the exploratory jurisdiction check V</w:t>
-      </w:r>
-      <w:r>
-        <w:rPr>
-          <w:vertAlign w:val="subscript"/>
-        </w:rPr>
-        <w:t>J</w:t>
-      </w:r>
-      <w:r>
-        <w:t xml:space="preserve">, are then evaluated, a Groth16 proof is generated and verified before access is granted, and the audit evidence is recorded. Beyond the access decision </w:t>
+        <w:t xml:space="preserve"> are then evaluated, a Groth16 proof is generated and verified before access is granted, and the audit evidence is recorded. Beyond the access decision </w:t>
       </w:r>
       <w:r>
         <w:t>shown in Figure 4.2</w:t>
@@ -28910,6 +28957,7 @@
     <w:p>
       <w:pPr>
         <w:pStyle w:val="2"/>
+        <w:keepNext/>
       </w:pPr>
       <w:r>
         <w:t>4.5 Overview of Solution for RQ1</w:t>
@@ -28930,6 +28978,7 @@
     <w:p>
       <w:pPr>
         <w:pStyle w:val="2"/>
+        <w:keepNext/>
       </w:pPr>
       <w:r>
         <w:t>4.6 Overview of Solution for RQ2</w:t>
@@ -28950,6 +28999,7 @@
     <w:p>
       <w:pPr>
         <w:pStyle w:val="2"/>
+        <w:keepNext/>
       </w:pPr>
       <w:r>
         <w:t>4.7 Overview of Solution for RQ3</w:t>
@@ -28970,6 +29020,7 @@
     <w:p>
       <w:pPr>
         <w:pStyle w:val="2"/>
+        <w:keepNext/>
       </w:pPr>
       <w:r>
         <w:t>4.8 Overview of Solution for RQ4</w:t>
@@ -28990,6 +29041,7 @@
     <w:p>
       <w:pPr>
         <w:pStyle w:val="2"/>
+        <w:keepNext/>
       </w:pPr>
       <w:r>
         <w:t>4.9 Overview of Solution for RQ5</w:t>
@@ -29010,6 +29062,7 @@
     <w:p>
       <w:pPr>
         <w:pStyle w:val="2"/>
+        <w:keepNext/>
       </w:pPr>
       <w:r>
         <w:t>4.10 Overview of Solution for RQ6</w:t>
@@ -29024,6 +29077,7 @@
     <w:p>
       <w:pPr>
         <w:pStyle w:val="3"/>
+        <w:keepNext/>
       </w:pPr>
       <w:r>
         <w:t>4.10.1 Testing and Verification of the Solution</w:t>
@@ -29038,6 +29092,7 @@
     <w:p>
       <w:pPr>
         <w:pStyle w:val="2"/>
+        <w:keepNext/>
       </w:pPr>
       <w:r>
         <w:t>4.11 Conclusion</w:t>
@@ -29114,6 +29169,7 @@
     <w:p>
       <w:pPr>
         <w:pStyle w:val="1"/>
+        <w:keepNext/>
         <w:spacing w:before="360"/>
       </w:pPr>
       <w:r/>
@@ -29134,6 +29190,7 @@
     <w:p>
       <w:pPr>
         <w:pStyle w:val="2"/>
+        <w:keepNext/>
       </w:pPr>
       <w:r>
         <w:t>5.1 Introduction</w:t>
@@ -29264,6 +29321,7 @@
     <w:p>
       <w:pPr>
         <w:pStyle w:val="2"/>
+        <w:keepNext/>
       </w:pPr>
       <w:r>
         <w:t>5.2 Layered Architecture and Component Decomposition</w:t>
@@ -29472,14 +29530,19 @@
         <w:t>I</w:t>
       </w:r>
       <w:r>
-        <w:t xml:space="preserve"> combines the doctor's credential check with the EIP-712 verification of each listed guardian's signature. The requester's DID and jurisdiction are declared in the </w:t>
-        <w:lastRenderedPageBreak/>
-        <w:t>interface rather than authenticated, and wallet-held signing keys, full DID resolution and proof that the user controls the DID are deferred to the next stage. However, each guardian approval is an EIP-712 typed-data signature bound to the consent identifier, so the multi-party threshold is enforced over signed approvals rather than over interface actions.</w:t>
+        <w:t xml:space="preserve"> combines the doctor's credential check with the EIP-712 verification of each listed guardian's signature. </w:t>
+      </w:r>
+      <w:r>
+        <w:t>The requester's DID is declared</w:t>
+      </w:r>
+      <w:r>
+        <w:t xml:space="preserve"> in the interface rather than authenticated, and wallet-held signing keys, full DID resolution and proof that the user controls the DID are deferred to the next stage. However, each guardian approval is an EIP-712 typed-data signature bound to the consent identifier, so the multi-party threshold is enforced over signed approvals rather than over interface actions.</w:t>
       </w:r>
     </w:p>
     <w:p>
       <w:pPr>
         <w:pStyle w:val="2"/>
+        <w:keepNext/>
       </w:pPr>
       <w:r>
         <w:t>5.3 Trust Evaluation and Architectural Boundaries</w:t>
@@ -29536,7 +29599,13 @@
         <w:t>L</w:t>
       </w:r>
       <w:r>
-        <w:t>(C), determines whether the consent remains in a valid lifecycle state. The integrated decision can therefore be expressed as Equation (3.2). In the current prototype, the Consent Engine derives the lifecycle state, a request proceeds only when this state is ACTIVE, and the revocation flag and the token are also checked within V</w:t>
+        <w:t xml:space="preserve">(C), determines whether the consent remains in a valid lifecycle state. The integrated decision </w:t>
+      </w:r>
+      <w:r>
+        <w:t>can therefore be expressed as Equation (5.1)</w:t>
+      </w:r>
+      <w:r>
+        <w:t>. In the current prototype, the Consent Engine derives the lifecycle state, a request proceeds only when this state is ACTIVE, and the revocation flag and the token are also checked within V</w:t>
       </w:r>
       <w:r>
         <w:rPr>
@@ -29545,28 +29614,215 @@
         <w:t>A</w:t>
       </w:r>
       <w:r>
-        <w:t xml:space="preserve">. The prototype interface also shows a check labelled VL, which compares the jurisdiction declared in the request with the jurisdiction recorded in the consent. </w:t>
-      </w:r>
-      <w:r>
-        <w:t>This thesis denotes</w:t>
-      </w:r>
-      <w:r>
-        <w:t xml:space="preserve"> that check V</w:t>
-      </w:r>
-      <w:r>
-        <w:rPr>
+        <w:t>.</w:t>
+      </w:r>
+    </w:p>
+    <w:p>
+      <w:pPr/>
+      <w:r>
+        <w:t>Equation (5.1) states that a request is allowed only when every one of the five conditions holds at the time of the request. Conversely, the failure of any one condition is sufficient for refusal, as Equation (5.2) states, and the success of the other conditions cannot compensate for it.</w:t>
+      </w:r>
+    </w:p>
+    <w:p>
+      <w:pPr>
+        <w:keepLines/>
+        <w:tabs>
+          <w:tab w:val="center" w:pos="4564"/>
+          <w:tab w:val="right" w:pos="9128"/>
+        </w:tabs>
+        <w:spacing w:before="80" w:after="160"/>
+      </w:pPr>
+      <w:r>
+        <w:rPr/>
+        <w:tab/>
+      </w:r>
+      <w:r>
+        <w:rPr>
+          <w:rFonts w:ascii="Cambria Math" w:hAnsi="Cambria Math" w:cs="Cambria Math" w:eastAsia="Cambria Math"/>
+          <w:sz w:val="18"/>
+        </w:rPr>
+        <w:t>Decision(C, R, t) = ALLOW ⟺ V</w:t>
+      </w:r>
+      <w:r>
+        <w:rPr>
+          <w:rFonts w:ascii="Cambria Math" w:hAnsi="Cambria Math" w:cs="Cambria Math" w:eastAsia="Cambria Math"/>
+          <w:sz w:val="18"/>
           <w:vertAlign w:val="subscript"/>
         </w:rPr>
-        <w:t>J</w:t>
-      </w:r>
-      <w:r>
-        <w:t xml:space="preserve"> and treats jurisdiction as a contextual policy condition for the next stage </w:t>
-      </w:r>
-      <w:r>
-        <w:t>(Chapter 8)</w:t>
-      </w:r>
-      <w:r>
-        <w:t>.</w:t>
+        <w:t>I</w:t>
+      </w:r>
+      <w:r>
+        <w:rPr>
+          <w:rFonts w:ascii="Cambria Math" w:hAnsi="Cambria Math" w:cs="Cambria Math" w:eastAsia="Cambria Math"/>
+          <w:sz w:val="18"/>
+        </w:rPr>
+        <w:t>(u) ∧ V</w:t>
+      </w:r>
+      <w:r>
+        <w:rPr>
+          <w:rFonts w:ascii="Cambria Math" w:hAnsi="Cambria Math" w:cs="Cambria Math" w:eastAsia="Cambria Math"/>
+          <w:sz w:val="18"/>
+          <w:vertAlign w:val="subscript"/>
+        </w:rPr>
+        <w:t>A</w:t>
+      </w:r>
+      <w:r>
+        <w:rPr>
+          <w:rFonts w:ascii="Cambria Math" w:hAnsi="Cambria Math" w:cs="Cambria Math" w:eastAsia="Cambria Math"/>
+          <w:sz w:val="18"/>
+        </w:rPr>
+        <w:t>(C) ∧ V</w:t>
+      </w:r>
+      <w:r>
+        <w:rPr>
+          <w:rFonts w:ascii="Cambria Math" w:hAnsi="Cambria Math" w:cs="Cambria Math" w:eastAsia="Cambria Math"/>
+          <w:sz w:val="18"/>
+          <w:vertAlign w:val="subscript"/>
+        </w:rPr>
+        <w:t>P</w:t>
+      </w:r>
+      <w:r>
+        <w:rPr>
+          <w:rFonts w:ascii="Cambria Math" w:hAnsi="Cambria Math" w:cs="Cambria Math" w:eastAsia="Cambria Math"/>
+          <w:sz w:val="18"/>
+        </w:rPr>
+        <w:t>(C, R) ∧ V</w:t>
+      </w:r>
+      <w:r>
+        <w:rPr>
+          <w:rFonts w:ascii="Cambria Math" w:hAnsi="Cambria Math" w:cs="Cambria Math" w:eastAsia="Cambria Math"/>
+          <w:sz w:val="18"/>
+          <w:vertAlign w:val="subscript"/>
+        </w:rPr>
+        <w:t>T</w:t>
+      </w:r>
+      <w:r>
+        <w:rPr>
+          <w:rFonts w:ascii="Cambria Math" w:hAnsi="Cambria Math" w:cs="Cambria Math" w:eastAsia="Cambria Math"/>
+          <w:sz w:val="18"/>
+        </w:rPr>
+        <w:t>(C, t) ∧ V</w:t>
+      </w:r>
+      <w:r>
+        <w:rPr>
+          <w:rFonts w:ascii="Cambria Math" w:hAnsi="Cambria Math" w:cs="Cambria Math" w:eastAsia="Cambria Math"/>
+          <w:sz w:val="18"/>
+          <w:vertAlign w:val="subscript"/>
+        </w:rPr>
+        <w:t>L</w:t>
+      </w:r>
+      <w:r>
+        <w:rPr>
+          <w:rFonts w:ascii="Cambria Math" w:hAnsi="Cambria Math" w:cs="Cambria Math" w:eastAsia="Cambria Math"/>
+          <w:sz w:val="18"/>
+        </w:rPr>
+        <w:t>(C).</w:t>
+      </w:r>
+      <w:r>
+        <w:rPr/>
+        <w:tab/>
+        <w:t>(5.1)</w:t>
+      </w:r>
+    </w:p>
+    <w:p>
+      <w:pPr>
+        <w:keepLines/>
+        <w:tabs>
+          <w:tab w:val="center" w:pos="4564"/>
+          <w:tab w:val="right" w:pos="9128"/>
+        </w:tabs>
+        <w:spacing w:before="80" w:after="160"/>
+      </w:pPr>
+      <w:r>
+        <w:rPr/>
+        <w:tab/>
+      </w:r>
+      <w:r>
+        <w:rPr>
+          <w:rFonts w:ascii="Cambria Math" w:hAnsi="Cambria Math" w:cs="Cambria Math" w:eastAsia="Cambria Math"/>
+          <w:sz w:val="18"/>
+        </w:rPr>
+        <w:t>¬(V</w:t>
+      </w:r>
+      <w:r>
+        <w:rPr>
+          <w:rFonts w:ascii="Cambria Math" w:hAnsi="Cambria Math" w:cs="Cambria Math" w:eastAsia="Cambria Math"/>
+          <w:sz w:val="18"/>
+          <w:vertAlign w:val="subscript"/>
+        </w:rPr>
+        <w:t>I</w:t>
+      </w:r>
+      <w:r>
+        <w:rPr>
+          <w:rFonts w:ascii="Cambria Math" w:hAnsi="Cambria Math" w:cs="Cambria Math" w:eastAsia="Cambria Math"/>
+          <w:sz w:val="18"/>
+        </w:rPr>
+        <w:t xml:space="preserve"> ∧ V</w:t>
+      </w:r>
+      <w:r>
+        <w:rPr>
+          <w:rFonts w:ascii="Cambria Math" w:hAnsi="Cambria Math" w:cs="Cambria Math" w:eastAsia="Cambria Math"/>
+          <w:sz w:val="18"/>
+          <w:vertAlign w:val="subscript"/>
+        </w:rPr>
+        <w:t>A</w:t>
+      </w:r>
+      <w:r>
+        <w:rPr>
+          <w:rFonts w:ascii="Cambria Math" w:hAnsi="Cambria Math" w:cs="Cambria Math" w:eastAsia="Cambria Math"/>
+          <w:sz w:val="18"/>
+        </w:rPr>
+        <w:t xml:space="preserve"> ∧ V</w:t>
+      </w:r>
+      <w:r>
+        <w:rPr>
+          <w:rFonts w:ascii="Cambria Math" w:hAnsi="Cambria Math" w:cs="Cambria Math" w:eastAsia="Cambria Math"/>
+          <w:sz w:val="18"/>
+          <w:vertAlign w:val="subscript"/>
+        </w:rPr>
+        <w:t>P</w:t>
+      </w:r>
+      <w:r>
+        <w:rPr>
+          <w:rFonts w:ascii="Cambria Math" w:hAnsi="Cambria Math" w:cs="Cambria Math" w:eastAsia="Cambria Math"/>
+          <w:sz w:val="18"/>
+        </w:rPr>
+        <w:t xml:space="preserve"> ∧ V</w:t>
+      </w:r>
+      <w:r>
+        <w:rPr>
+          <w:rFonts w:ascii="Cambria Math" w:hAnsi="Cambria Math" w:cs="Cambria Math" w:eastAsia="Cambria Math"/>
+          <w:sz w:val="18"/>
+          <w:vertAlign w:val="subscript"/>
+        </w:rPr>
+        <w:t>T</w:t>
+      </w:r>
+      <w:r>
+        <w:rPr>
+          <w:rFonts w:ascii="Cambria Math" w:hAnsi="Cambria Math" w:cs="Cambria Math" w:eastAsia="Cambria Math"/>
+          <w:sz w:val="18"/>
+        </w:rPr>
+        <w:t xml:space="preserve"> ∧ V</w:t>
+      </w:r>
+      <w:r>
+        <w:rPr>
+          <w:rFonts w:ascii="Cambria Math" w:hAnsi="Cambria Math" w:cs="Cambria Math" w:eastAsia="Cambria Math"/>
+          <w:sz w:val="18"/>
+          <w:vertAlign w:val="subscript"/>
+        </w:rPr>
+        <w:t>L</w:t>
+      </w:r>
+      <w:r>
+        <w:rPr>
+          <w:rFonts w:ascii="Cambria Math" w:hAnsi="Cambria Math" w:cs="Cambria Math" w:eastAsia="Cambria Math"/>
+          <w:sz w:val="18"/>
+        </w:rPr>
+        <w:t>) ⟹ Decision(C, R, t) = DENY.</w:t>
+      </w:r>
+      <w:r>
+        <w:rPr/>
+        <w:tab/>
+        <w:t>(5.2)</w:t>
       </w:r>
     </w:p>
     <w:p>
@@ -29742,6 +29998,7 @@
     <w:p>
       <w:pPr>
         <w:pStyle w:val="2"/>
+        <w:keepNext/>
       </w:pPr>
       <w:r>
         <w:t>5.4 MVC Architecture and the Research Objectives</w:t>
@@ -31706,6 +31963,7 @@
     <w:p>
       <w:pPr>
         <w:pStyle w:val="2"/>
+        <w:keepNext/>
       </w:pPr>
       <w:r>
         <w:t>5.5 Trust-Centric Consent Model</w:t>
@@ -31732,7 +31990,7 @@
         <w:t xml:space="preserve">RO1 addresses RQ1 by developing a trust-aware consent model that represents patient consent as a structured and evaluable authorisation object. The purpose of this objective is to establish a formal representation of what the patient intends to authorise, who is permitted to participate in the authorisation process, which healthcare data may be accessed, and under what conditions. The proposed consent object is represented as </w:t>
       </w:r>
       <w:r>
-        <w:t>Equation (5.1)</w:t>
+        <w:t>Equation (5.3)</w:t>
       </w:r>
       <w:r>
         <w:t>.</w:t>
@@ -31762,7 +32020,7 @@
         <w:tab/>
       </w:r>
       <w:r>
-        <w:t>(5.1)</w:t>
+        <w:t>(5.3)</w:t>
       </w:r>
     </w:p>
     <w:p>
@@ -31771,7 +32029,7 @@
         <w:jc w:val="both"/>
       </w:pPr>
       <w:r>
-        <w:t>In Equation (5.1)</w:t>
+        <w:t>In Equation (5.3)</w:t>
       </w:r>
       <w:r>
         <w:t xml:space="preserve">, I represents patient and participant identity information, A represents authorisation requirements, P represents policy constraints, and E represents authorisation evidence. T represents the temporal validity window, and L represents the current state of the consent object and its permissible transitions. </w:t>
@@ -31786,6 +32044,7 @@
     <w:p>
       <w:pPr>
         <w:pStyle w:val="3"/>
+        <w:keepNext/>
       </w:pPr>
       <w:r>
         <w:t>5.5.1 Consent Creation Workflow</w:t>
@@ -31891,10 +32150,7 @@
         <w:jc w:val="both"/>
       </w:pPr>
       <w:r>
-        <w:t xml:space="preserve">The specification is accepted only when the required fields are valid. For example, the expiry time must be later than the start time, the data scope must not be empty, and each guardian DID must be well formed. After validation, the system creates the consent object, assigns a consent identifier, persists the record, and records the creation event in the audit layer. This process ensures that the consent object contains sufficient information for subsequent identity verification, multi-party authorisation, policy evaluation, and auditability. Once the consent object is created, its lifecycle state L becomes PENDING, because the consent cannot produce an effective authorisation decision until the required approvals have been obtained. In the current prototype, this state is PENDING_SIGNATURE, and the interface also records a jurisdiction code, AU in the demonstrated transactions, for the exploratory jurisdiction check </w:t>
-      </w:r>
-      <w:r>
-        <w:t>(Chapter 8)</w:t>
+        <w:t>The specification is accepted only when the required fields are valid. For example, the expiry time must be later than the start time, the data scope must not be empty, and each guardian DID must be well formed. After validation, the system creates the consent object, assigns a consent identifier, persists the record, and records the creation event in the audit layer. This process ensures that the consent object contains sufficient information for subsequent identity verification, multi-party authorisation, policy evaluation, and auditability. Once the consent object is created, its lifecycle state L becomes PENDING, because the consent cannot produce an effective authorisation decision until the required approvals have been obtained. In the current prototype, this state is PENDING_SIGNATURE</w:t>
       </w:r>
       <w:r>
         <w:t>.</w:t>
@@ -31903,6 +32159,7 @@
     <w:p>
       <w:pPr>
         <w:pStyle w:val="3"/>
+        <w:keepNext/>
       </w:pPr>
       <w:r>
         <w:t>5.5.2 Structure of the Consent Object</w:t>
@@ -32021,6 +32278,7 @@
     <w:p>
       <w:pPr>
         <w:pStyle w:val="3"/>
+        <w:keepNext/>
       </w:pPr>
       <w:r>
         <w:t>5.5.3 Trust-Aware Consent Creation Procedure and Algorithm</w:t>
@@ -33072,6 +33330,7 @@
     <w:p>
       <w:pPr>
         <w:pStyle w:val="2"/>
+        <w:keepNext/>
       </w:pPr>
       <w:r>
         <w:t>5.6 Prototype Implementation</w:t>
@@ -33098,6 +33357,7 @@
     <w:p>
       <w:pPr>
         <w:pStyle w:val="3"/>
+        <w:keepNext/>
       </w:pPr>
       <w:r>
         <w:t>5.6.1 Aims of Engineering the Prototype System</w:t>
@@ -33124,6 +33384,7 @@
     <w:p>
       <w:pPr>
         <w:pStyle w:val="2"/>
+        <w:keepNext/>
       </w:pPr>
       <w:r>
         <w:t>5.7 Datasets Used for Validation</w:t>
@@ -34055,6 +34316,7 @@
     <w:p>
       <w:pPr>
         <w:pStyle w:val="2"/>
+        <w:keepNext/>
       </w:pPr>
       <w:r>
         <w:t>5.8 Steps in the Working of the Prototype System for Consent Creation</w:t>
@@ -34069,6 +34331,7 @@
     <w:p>
       <w:pPr>
         <w:pStyle w:val="3"/>
+        <w:keepNext/>
       </w:pPr>
       <w:r>
         <w:t>5.8.1 Steps in the patient interface</w:t>
@@ -34101,6 +34364,7 @@
     <w:p>
       <w:pPr>
         <w:pStyle w:val="3"/>
+        <w:keepNext/>
       </w:pPr>
       <w:r>
         <w:t>5.8.2 Steps in the service layer</w:t>
@@ -34172,6 +34436,7 @@
     <w:p>
       <w:pPr>
         <w:pStyle w:val="2"/>
+        <w:keepNext/>
       </w:pPr>
       <w:r>
         <w:t>5.9 Prototype Evaluation and Discussion</w:t>
@@ -34186,6 +34451,7 @@
     <w:p>
       <w:pPr>
         <w:pStyle w:val="3"/>
+        <w:keepNext/>
       </w:pPr>
       <w:r>
         <w:t>5.9.1 Validation of Consent Creation</w:t>
@@ -35304,6 +35570,7 @@
     <w:p>
       <w:pPr>
         <w:pStyle w:val="3"/>
+        <w:keepNext/>
       </w:pPr>
       <w:r>
         <w:t>5.9.2 Evaluation of the Architecture against the Security Properties</w:t>
@@ -36127,6 +36394,7 @@
     <w:p>
       <w:pPr>
         <w:pStyle w:val="3"/>
+        <w:keepNext/>
       </w:pPr>
       <w:r>
         <w:t>5.9.3 Discussion</w:t>
@@ -36147,6 +36415,7 @@
     <w:p>
       <w:pPr>
         <w:pStyle w:val="2"/>
+        <w:keepNext/>
       </w:pPr>
       <w:r>
         <w:t>5.10 Conclusion</w:t>

</xml_diff>